<commit_message>
Add Definition of Done to every ticket
Each story in both drafts now carries a repeated Definition of Done
checklist (AC verified, code reviewed, tests passing, no regressions,
docs updated, deployed to staging/UAT, PO sign-off) alongside its
Acceptance Criteria, so each ticket is self-contained on Jira import.

Updated the skill itself so future PRD runs include this by default.

Co-Authored-By: Claude Sonnet 5 <noreply@anthropic.com>
Claude-Session: https://claude.ai/code/session_018UqDCZmfeJsSLZ2VRvShwy
</commit_message>
<xml_diff>
--- a/deliverables/afml-reporting/AFML_Reporting_Epics_Tickets_Draft.docx
+++ b/deliverables/afml-reporting/AFML_Reporting_Epics_Tickets_Draft.docx
@@ -445,6 +445,70 @@
         <w:rPr>
           <w:b/>
         </w:rPr>
+        <w:t>Definition of Done:</w:t>
+      </w:r>
+    </w:p>
+    <w:p>
+      <w:pPr>
+        <w:pStyle w:val="ListBullet"/>
+      </w:pPr>
+      <w:r>
+        <w:t>Acceptance criteria above are met and verified</w:t>
+      </w:r>
+    </w:p>
+    <w:p>
+      <w:pPr>
+        <w:pStyle w:val="ListBullet"/>
+      </w:pPr>
+      <w:r>
+        <w:t>Code reviewed and approved</w:t>
+      </w:r>
+    </w:p>
+    <w:p>
+      <w:pPr>
+        <w:pStyle w:val="ListBullet"/>
+      </w:pPr>
+      <w:r>
+        <w:t>Automated tests (unit/integration) written and passing</w:t>
+      </w:r>
+    </w:p>
+    <w:p>
+      <w:pPr>
+        <w:pStyle w:val="ListBullet"/>
+      </w:pPr>
+      <w:r>
+        <w:t>No regression introduced in existing functionality</w:t>
+      </w:r>
+    </w:p>
+    <w:p>
+      <w:pPr>
+        <w:pStyle w:val="ListBullet"/>
+      </w:pPr>
+      <w:r>
+        <w:t>Relevant documentation updated</w:t>
+      </w:r>
+    </w:p>
+    <w:p>
+      <w:pPr>
+        <w:pStyle w:val="ListBullet"/>
+      </w:pPr>
+      <w:r>
+        <w:t>Deployed to staging/UAT and verified</w:t>
+      </w:r>
+    </w:p>
+    <w:p>
+      <w:pPr>
+        <w:pStyle w:val="ListBullet"/>
+      </w:pPr>
+      <w:r>
+        <w:t>Product Owner sign-off obtained</w:t>
+      </w:r>
+    </w:p>
+    <w:p>
+      <w:r>
+        <w:rPr>
+          <w:b/>
+        </w:rPr>
         <w:t xml:space="preserve">Notes: </w:t>
       </w:r>
       <w:r>
@@ -531,6 +595,70 @@
         <w:rPr>
           <w:b/>
         </w:rPr>
+        <w:t>Definition of Done:</w:t>
+      </w:r>
+    </w:p>
+    <w:p>
+      <w:pPr>
+        <w:pStyle w:val="ListBullet"/>
+      </w:pPr>
+      <w:r>
+        <w:t>Acceptance criteria above are met and verified</w:t>
+      </w:r>
+    </w:p>
+    <w:p>
+      <w:pPr>
+        <w:pStyle w:val="ListBullet"/>
+      </w:pPr>
+      <w:r>
+        <w:t>Code reviewed and approved</w:t>
+      </w:r>
+    </w:p>
+    <w:p>
+      <w:pPr>
+        <w:pStyle w:val="ListBullet"/>
+      </w:pPr>
+      <w:r>
+        <w:t>Automated tests (unit/integration) written and passing</w:t>
+      </w:r>
+    </w:p>
+    <w:p>
+      <w:pPr>
+        <w:pStyle w:val="ListBullet"/>
+      </w:pPr>
+      <w:r>
+        <w:t>No regression introduced in existing functionality</w:t>
+      </w:r>
+    </w:p>
+    <w:p>
+      <w:pPr>
+        <w:pStyle w:val="ListBullet"/>
+      </w:pPr>
+      <w:r>
+        <w:t>Relevant documentation updated</w:t>
+      </w:r>
+    </w:p>
+    <w:p>
+      <w:pPr>
+        <w:pStyle w:val="ListBullet"/>
+      </w:pPr>
+      <w:r>
+        <w:t>Deployed to staging/UAT and verified</w:t>
+      </w:r>
+    </w:p>
+    <w:p>
+      <w:pPr>
+        <w:pStyle w:val="ListBullet"/>
+      </w:pPr>
+      <w:r>
+        <w:t>Product Owner sign-off obtained</w:t>
+      </w:r>
+    </w:p>
+    <w:p>
+      <w:r>
+        <w:rPr>
+          <w:b/>
+        </w:rPr>
         <w:t xml:space="preserve">Notes: </w:t>
       </w:r>
       <w:r>
@@ -617,6 +745,70 @@
         <w:rPr>
           <w:b/>
         </w:rPr>
+        <w:t>Definition of Done:</w:t>
+      </w:r>
+    </w:p>
+    <w:p>
+      <w:pPr>
+        <w:pStyle w:val="ListBullet"/>
+      </w:pPr>
+      <w:r>
+        <w:t>Acceptance criteria above are met and verified</w:t>
+      </w:r>
+    </w:p>
+    <w:p>
+      <w:pPr>
+        <w:pStyle w:val="ListBullet"/>
+      </w:pPr>
+      <w:r>
+        <w:t>Code reviewed and approved</w:t>
+      </w:r>
+    </w:p>
+    <w:p>
+      <w:pPr>
+        <w:pStyle w:val="ListBullet"/>
+      </w:pPr>
+      <w:r>
+        <w:t>Automated tests (unit/integration) written and passing</w:t>
+      </w:r>
+    </w:p>
+    <w:p>
+      <w:pPr>
+        <w:pStyle w:val="ListBullet"/>
+      </w:pPr>
+      <w:r>
+        <w:t>No regression introduced in existing functionality</w:t>
+      </w:r>
+    </w:p>
+    <w:p>
+      <w:pPr>
+        <w:pStyle w:val="ListBullet"/>
+      </w:pPr>
+      <w:r>
+        <w:t>Relevant documentation updated</w:t>
+      </w:r>
+    </w:p>
+    <w:p>
+      <w:pPr>
+        <w:pStyle w:val="ListBullet"/>
+      </w:pPr>
+      <w:r>
+        <w:t>Deployed to staging/UAT and verified</w:t>
+      </w:r>
+    </w:p>
+    <w:p>
+      <w:pPr>
+        <w:pStyle w:val="ListBullet"/>
+      </w:pPr>
+      <w:r>
+        <w:t>Product Owner sign-off obtained</w:t>
+      </w:r>
+    </w:p>
+    <w:p>
+      <w:r>
+        <w:rPr>
+          <w:b/>
+        </w:rPr>
         <w:t xml:space="preserve">Notes: </w:t>
       </w:r>
       <w:r>
@@ -719,6 +911,70 @@
         <w:rPr>
           <w:b/>
         </w:rPr>
+        <w:t>Definition of Done:</w:t>
+      </w:r>
+    </w:p>
+    <w:p>
+      <w:pPr>
+        <w:pStyle w:val="ListBullet"/>
+      </w:pPr>
+      <w:r>
+        <w:t>Acceptance criteria above are met and verified</w:t>
+      </w:r>
+    </w:p>
+    <w:p>
+      <w:pPr>
+        <w:pStyle w:val="ListBullet"/>
+      </w:pPr>
+      <w:r>
+        <w:t>Code reviewed and approved</w:t>
+      </w:r>
+    </w:p>
+    <w:p>
+      <w:pPr>
+        <w:pStyle w:val="ListBullet"/>
+      </w:pPr>
+      <w:r>
+        <w:t>Automated tests (unit/integration) written and passing</w:t>
+      </w:r>
+    </w:p>
+    <w:p>
+      <w:pPr>
+        <w:pStyle w:val="ListBullet"/>
+      </w:pPr>
+      <w:r>
+        <w:t>No regression introduced in existing functionality</w:t>
+      </w:r>
+    </w:p>
+    <w:p>
+      <w:pPr>
+        <w:pStyle w:val="ListBullet"/>
+      </w:pPr>
+      <w:r>
+        <w:t>Relevant documentation updated</w:t>
+      </w:r>
+    </w:p>
+    <w:p>
+      <w:pPr>
+        <w:pStyle w:val="ListBullet"/>
+      </w:pPr>
+      <w:r>
+        <w:t>Deployed to staging/UAT and verified</w:t>
+      </w:r>
+    </w:p>
+    <w:p>
+      <w:pPr>
+        <w:pStyle w:val="ListBullet"/>
+      </w:pPr>
+      <w:r>
+        <w:t>Product Owner sign-off obtained</w:t>
+      </w:r>
+    </w:p>
+    <w:p>
+      <w:r>
+        <w:rPr>
+          <w:b/>
+        </w:rPr>
         <w:t xml:space="preserve">Notes: </w:t>
       </w:r>
       <w:r>
@@ -826,6 +1082,70 @@
         <w:rPr>
           <w:b/>
         </w:rPr>
+        <w:t>Definition of Done:</w:t>
+      </w:r>
+    </w:p>
+    <w:p>
+      <w:pPr>
+        <w:pStyle w:val="ListBullet"/>
+      </w:pPr>
+      <w:r>
+        <w:t>Acceptance criteria above are met and verified</w:t>
+      </w:r>
+    </w:p>
+    <w:p>
+      <w:pPr>
+        <w:pStyle w:val="ListBullet"/>
+      </w:pPr>
+      <w:r>
+        <w:t>Code reviewed and approved</w:t>
+      </w:r>
+    </w:p>
+    <w:p>
+      <w:pPr>
+        <w:pStyle w:val="ListBullet"/>
+      </w:pPr>
+      <w:r>
+        <w:t>Automated tests (unit/integration) written and passing</w:t>
+      </w:r>
+    </w:p>
+    <w:p>
+      <w:pPr>
+        <w:pStyle w:val="ListBullet"/>
+      </w:pPr>
+      <w:r>
+        <w:t>No regression introduced in existing functionality</w:t>
+      </w:r>
+    </w:p>
+    <w:p>
+      <w:pPr>
+        <w:pStyle w:val="ListBullet"/>
+      </w:pPr>
+      <w:r>
+        <w:t>Relevant documentation updated</w:t>
+      </w:r>
+    </w:p>
+    <w:p>
+      <w:pPr>
+        <w:pStyle w:val="ListBullet"/>
+      </w:pPr>
+      <w:r>
+        <w:t>Deployed to staging/UAT and verified</w:t>
+      </w:r>
+    </w:p>
+    <w:p>
+      <w:pPr>
+        <w:pStyle w:val="ListBullet"/>
+      </w:pPr>
+      <w:r>
+        <w:t>Product Owner sign-off obtained</w:t>
+      </w:r>
+    </w:p>
+    <w:p>
+      <w:r>
+        <w:rPr>
+          <w:b/>
+        </w:rPr>
         <w:t xml:space="preserve">Notes: </w:t>
       </w:r>
       <w:r>
@@ -904,6 +1224,70 @@
         <w:rPr>
           <w:b/>
         </w:rPr>
+        <w:t>Definition of Done:</w:t>
+      </w:r>
+    </w:p>
+    <w:p>
+      <w:pPr>
+        <w:pStyle w:val="ListBullet"/>
+      </w:pPr>
+      <w:r>
+        <w:t>Acceptance criteria above are met and verified</w:t>
+      </w:r>
+    </w:p>
+    <w:p>
+      <w:pPr>
+        <w:pStyle w:val="ListBullet"/>
+      </w:pPr>
+      <w:r>
+        <w:t>Code reviewed and approved</w:t>
+      </w:r>
+    </w:p>
+    <w:p>
+      <w:pPr>
+        <w:pStyle w:val="ListBullet"/>
+      </w:pPr>
+      <w:r>
+        <w:t>Automated tests (unit/integration) written and passing</w:t>
+      </w:r>
+    </w:p>
+    <w:p>
+      <w:pPr>
+        <w:pStyle w:val="ListBullet"/>
+      </w:pPr>
+      <w:r>
+        <w:t>No regression introduced in existing functionality</w:t>
+      </w:r>
+    </w:p>
+    <w:p>
+      <w:pPr>
+        <w:pStyle w:val="ListBullet"/>
+      </w:pPr>
+      <w:r>
+        <w:t>Relevant documentation updated</w:t>
+      </w:r>
+    </w:p>
+    <w:p>
+      <w:pPr>
+        <w:pStyle w:val="ListBullet"/>
+      </w:pPr>
+      <w:r>
+        <w:t>Deployed to staging/UAT and verified</w:t>
+      </w:r>
+    </w:p>
+    <w:p>
+      <w:pPr>
+        <w:pStyle w:val="ListBullet"/>
+      </w:pPr>
+      <w:r>
+        <w:t>Product Owner sign-off obtained</w:t>
+      </w:r>
+    </w:p>
+    <w:p>
+      <w:r>
+        <w:rPr>
+          <w:b/>
+        </w:rPr>
         <w:t xml:space="preserve">Notes: </w:t>
       </w:r>
       <w:r>
@@ -977,6 +1361,70 @@
         <w:rPr>
           <w:b/>
         </w:rPr>
+        <w:t>Definition of Done:</w:t>
+      </w:r>
+    </w:p>
+    <w:p>
+      <w:pPr>
+        <w:pStyle w:val="ListBullet"/>
+      </w:pPr>
+      <w:r>
+        <w:t>Acceptance criteria above are met and verified</w:t>
+      </w:r>
+    </w:p>
+    <w:p>
+      <w:pPr>
+        <w:pStyle w:val="ListBullet"/>
+      </w:pPr>
+      <w:r>
+        <w:t>Code reviewed and approved</w:t>
+      </w:r>
+    </w:p>
+    <w:p>
+      <w:pPr>
+        <w:pStyle w:val="ListBullet"/>
+      </w:pPr>
+      <w:r>
+        <w:t>Automated tests (unit/integration) written and passing</w:t>
+      </w:r>
+    </w:p>
+    <w:p>
+      <w:pPr>
+        <w:pStyle w:val="ListBullet"/>
+      </w:pPr>
+      <w:r>
+        <w:t>No regression introduced in existing functionality</w:t>
+      </w:r>
+    </w:p>
+    <w:p>
+      <w:pPr>
+        <w:pStyle w:val="ListBullet"/>
+      </w:pPr>
+      <w:r>
+        <w:t>Relevant documentation updated</w:t>
+      </w:r>
+    </w:p>
+    <w:p>
+      <w:pPr>
+        <w:pStyle w:val="ListBullet"/>
+      </w:pPr>
+      <w:r>
+        <w:t>Deployed to staging/UAT and verified</w:t>
+      </w:r>
+    </w:p>
+    <w:p>
+      <w:pPr>
+        <w:pStyle w:val="ListBullet"/>
+      </w:pPr>
+      <w:r>
+        <w:t>Product Owner sign-off obtained</w:t>
+      </w:r>
+    </w:p>
+    <w:p>
+      <w:r>
+        <w:rPr>
+          <w:b/>
+        </w:rPr>
         <w:t xml:space="preserve">Notes: </w:t>
       </w:r>
       <w:r>
@@ -1068,6 +1516,70 @@
         <w:rPr>
           <w:b/>
         </w:rPr>
+        <w:t>Definition of Done:</w:t>
+      </w:r>
+    </w:p>
+    <w:p>
+      <w:pPr>
+        <w:pStyle w:val="ListBullet"/>
+      </w:pPr>
+      <w:r>
+        <w:t>Acceptance criteria above are met and verified</w:t>
+      </w:r>
+    </w:p>
+    <w:p>
+      <w:pPr>
+        <w:pStyle w:val="ListBullet"/>
+      </w:pPr>
+      <w:r>
+        <w:t>Code reviewed and approved</w:t>
+      </w:r>
+    </w:p>
+    <w:p>
+      <w:pPr>
+        <w:pStyle w:val="ListBullet"/>
+      </w:pPr>
+      <w:r>
+        <w:t>Automated tests (unit/integration) written and passing</w:t>
+      </w:r>
+    </w:p>
+    <w:p>
+      <w:pPr>
+        <w:pStyle w:val="ListBullet"/>
+      </w:pPr>
+      <w:r>
+        <w:t>No regression introduced in existing functionality</w:t>
+      </w:r>
+    </w:p>
+    <w:p>
+      <w:pPr>
+        <w:pStyle w:val="ListBullet"/>
+      </w:pPr>
+      <w:r>
+        <w:t>Relevant documentation updated</w:t>
+      </w:r>
+    </w:p>
+    <w:p>
+      <w:pPr>
+        <w:pStyle w:val="ListBullet"/>
+      </w:pPr>
+      <w:r>
+        <w:t>Deployed to staging/UAT and verified</w:t>
+      </w:r>
+    </w:p>
+    <w:p>
+      <w:pPr>
+        <w:pStyle w:val="ListBullet"/>
+      </w:pPr>
+      <w:r>
+        <w:t>Product Owner sign-off obtained</w:t>
+      </w:r>
+    </w:p>
+    <w:p>
+      <w:r>
+        <w:rPr>
+          <w:b/>
+        </w:rPr>
         <w:t xml:space="preserve">Notes: </w:t>
       </w:r>
       <w:r>
@@ -1130,6 +1642,70 @@
         <w:rPr>
           <w:b/>
         </w:rPr>
+        <w:t>Definition of Done:</w:t>
+      </w:r>
+    </w:p>
+    <w:p>
+      <w:pPr>
+        <w:pStyle w:val="ListBullet"/>
+      </w:pPr>
+      <w:r>
+        <w:t>Acceptance criteria above are met and verified</w:t>
+      </w:r>
+    </w:p>
+    <w:p>
+      <w:pPr>
+        <w:pStyle w:val="ListBullet"/>
+      </w:pPr>
+      <w:r>
+        <w:t>Code reviewed and approved</w:t>
+      </w:r>
+    </w:p>
+    <w:p>
+      <w:pPr>
+        <w:pStyle w:val="ListBullet"/>
+      </w:pPr>
+      <w:r>
+        <w:t>Automated tests (unit/integration) written and passing</w:t>
+      </w:r>
+    </w:p>
+    <w:p>
+      <w:pPr>
+        <w:pStyle w:val="ListBullet"/>
+      </w:pPr>
+      <w:r>
+        <w:t>No regression introduced in existing functionality</w:t>
+      </w:r>
+    </w:p>
+    <w:p>
+      <w:pPr>
+        <w:pStyle w:val="ListBullet"/>
+      </w:pPr>
+      <w:r>
+        <w:t>Relevant documentation updated</w:t>
+      </w:r>
+    </w:p>
+    <w:p>
+      <w:pPr>
+        <w:pStyle w:val="ListBullet"/>
+      </w:pPr>
+      <w:r>
+        <w:t>Deployed to staging/UAT and verified</w:t>
+      </w:r>
+    </w:p>
+    <w:p>
+      <w:pPr>
+        <w:pStyle w:val="ListBullet"/>
+      </w:pPr>
+      <w:r>
+        <w:t>Product Owner sign-off obtained</w:t>
+      </w:r>
+    </w:p>
+    <w:p>
+      <w:r>
+        <w:rPr>
+          <w:b/>
+        </w:rPr>
         <w:t xml:space="preserve">Notes: </w:t>
       </w:r>
       <w:r>
@@ -1200,6 +1776,70 @@
         <w:rPr>
           <w:b/>
         </w:rPr>
+        <w:t>Definition of Done:</w:t>
+      </w:r>
+    </w:p>
+    <w:p>
+      <w:pPr>
+        <w:pStyle w:val="ListBullet"/>
+      </w:pPr>
+      <w:r>
+        <w:t>Acceptance criteria above are met and verified</w:t>
+      </w:r>
+    </w:p>
+    <w:p>
+      <w:pPr>
+        <w:pStyle w:val="ListBullet"/>
+      </w:pPr>
+      <w:r>
+        <w:t>Code reviewed and approved</w:t>
+      </w:r>
+    </w:p>
+    <w:p>
+      <w:pPr>
+        <w:pStyle w:val="ListBullet"/>
+      </w:pPr>
+      <w:r>
+        <w:t>Automated tests (unit/integration) written and passing</w:t>
+      </w:r>
+    </w:p>
+    <w:p>
+      <w:pPr>
+        <w:pStyle w:val="ListBullet"/>
+      </w:pPr>
+      <w:r>
+        <w:t>No regression introduced in existing functionality</w:t>
+      </w:r>
+    </w:p>
+    <w:p>
+      <w:pPr>
+        <w:pStyle w:val="ListBullet"/>
+      </w:pPr>
+      <w:r>
+        <w:t>Relevant documentation updated</w:t>
+      </w:r>
+    </w:p>
+    <w:p>
+      <w:pPr>
+        <w:pStyle w:val="ListBullet"/>
+      </w:pPr>
+      <w:r>
+        <w:t>Deployed to staging/UAT and verified</w:t>
+      </w:r>
+    </w:p>
+    <w:p>
+      <w:pPr>
+        <w:pStyle w:val="ListBullet"/>
+      </w:pPr>
+      <w:r>
+        <w:t>Product Owner sign-off obtained</w:t>
+      </w:r>
+    </w:p>
+    <w:p>
+      <w:r>
+        <w:rPr>
+          <w:b/>
+        </w:rPr>
         <w:t xml:space="preserve">Notes: </w:t>
       </w:r>
       <w:r>
@@ -1254,6 +1894,70 @@
         <w:rPr>
           <w:b/>
         </w:rPr>
+        <w:t>Definition of Done:</w:t>
+      </w:r>
+    </w:p>
+    <w:p>
+      <w:pPr>
+        <w:pStyle w:val="ListBullet"/>
+      </w:pPr>
+      <w:r>
+        <w:t>Acceptance criteria above are met and verified</w:t>
+      </w:r>
+    </w:p>
+    <w:p>
+      <w:pPr>
+        <w:pStyle w:val="ListBullet"/>
+      </w:pPr>
+      <w:r>
+        <w:t>Code reviewed and approved</w:t>
+      </w:r>
+    </w:p>
+    <w:p>
+      <w:pPr>
+        <w:pStyle w:val="ListBullet"/>
+      </w:pPr>
+      <w:r>
+        <w:t>Automated tests (unit/integration) written and passing</w:t>
+      </w:r>
+    </w:p>
+    <w:p>
+      <w:pPr>
+        <w:pStyle w:val="ListBullet"/>
+      </w:pPr>
+      <w:r>
+        <w:t>No regression introduced in existing functionality</w:t>
+      </w:r>
+    </w:p>
+    <w:p>
+      <w:pPr>
+        <w:pStyle w:val="ListBullet"/>
+      </w:pPr>
+      <w:r>
+        <w:t>Relevant documentation updated</w:t>
+      </w:r>
+    </w:p>
+    <w:p>
+      <w:pPr>
+        <w:pStyle w:val="ListBullet"/>
+      </w:pPr>
+      <w:r>
+        <w:t>Deployed to staging/UAT and verified</w:t>
+      </w:r>
+    </w:p>
+    <w:p>
+      <w:pPr>
+        <w:pStyle w:val="ListBullet"/>
+      </w:pPr>
+      <w:r>
+        <w:t>Product Owner sign-off obtained</w:t>
+      </w:r>
+    </w:p>
+    <w:p>
+      <w:r>
+        <w:rPr>
+          <w:b/>
+        </w:rPr>
         <w:t xml:space="preserve">Notes: </w:t>
       </w:r>
       <w:r>
@@ -1316,6 +2020,70 @@
         <w:rPr>
           <w:b/>
         </w:rPr>
+        <w:t>Definition of Done:</w:t>
+      </w:r>
+    </w:p>
+    <w:p>
+      <w:pPr>
+        <w:pStyle w:val="ListBullet"/>
+      </w:pPr>
+      <w:r>
+        <w:t>Acceptance criteria above are met and verified</w:t>
+      </w:r>
+    </w:p>
+    <w:p>
+      <w:pPr>
+        <w:pStyle w:val="ListBullet"/>
+      </w:pPr>
+      <w:r>
+        <w:t>Code reviewed and approved</w:t>
+      </w:r>
+    </w:p>
+    <w:p>
+      <w:pPr>
+        <w:pStyle w:val="ListBullet"/>
+      </w:pPr>
+      <w:r>
+        <w:t>Automated tests (unit/integration) written and passing</w:t>
+      </w:r>
+    </w:p>
+    <w:p>
+      <w:pPr>
+        <w:pStyle w:val="ListBullet"/>
+      </w:pPr>
+      <w:r>
+        <w:t>No regression introduced in existing functionality</w:t>
+      </w:r>
+    </w:p>
+    <w:p>
+      <w:pPr>
+        <w:pStyle w:val="ListBullet"/>
+      </w:pPr>
+      <w:r>
+        <w:t>Relevant documentation updated</w:t>
+      </w:r>
+    </w:p>
+    <w:p>
+      <w:pPr>
+        <w:pStyle w:val="ListBullet"/>
+      </w:pPr>
+      <w:r>
+        <w:t>Deployed to staging/UAT and verified</w:t>
+      </w:r>
+    </w:p>
+    <w:p>
+      <w:pPr>
+        <w:pStyle w:val="ListBullet"/>
+      </w:pPr>
+      <w:r>
+        <w:t>Product Owner sign-off obtained</w:t>
+      </w:r>
+    </w:p>
+    <w:p>
+      <w:r>
+        <w:rPr>
+          <w:b/>
+        </w:rPr>
         <w:t xml:space="preserve">Notes: </w:t>
       </w:r>
       <w:r>
@@ -1371,6 +2139,70 @@
       </w:pPr>
       <w:r>
         <w:t>Given a regulatory report is submitted to the regulator, when the submission occurs, then who submitted it and when is logged separately and retrievably for audit purposes.</w:t>
+      </w:r>
+    </w:p>
+    <w:p>
+      <w:r>
+        <w:rPr>
+          <w:b/>
+        </w:rPr>
+        <w:t>Definition of Done:</w:t>
+      </w:r>
+    </w:p>
+    <w:p>
+      <w:pPr>
+        <w:pStyle w:val="ListBullet"/>
+      </w:pPr>
+      <w:r>
+        <w:t>Acceptance criteria above are met and verified</w:t>
+      </w:r>
+    </w:p>
+    <w:p>
+      <w:pPr>
+        <w:pStyle w:val="ListBullet"/>
+      </w:pPr>
+      <w:r>
+        <w:t>Code reviewed and approved</w:t>
+      </w:r>
+    </w:p>
+    <w:p>
+      <w:pPr>
+        <w:pStyle w:val="ListBullet"/>
+      </w:pPr>
+      <w:r>
+        <w:t>Automated tests (unit/integration) written and passing</w:t>
+      </w:r>
+    </w:p>
+    <w:p>
+      <w:pPr>
+        <w:pStyle w:val="ListBullet"/>
+      </w:pPr>
+      <w:r>
+        <w:t>No regression introduced in existing functionality</w:t>
+      </w:r>
+    </w:p>
+    <w:p>
+      <w:pPr>
+        <w:pStyle w:val="ListBullet"/>
+      </w:pPr>
+      <w:r>
+        <w:t>Relevant documentation updated</w:t>
+      </w:r>
+    </w:p>
+    <w:p>
+      <w:pPr>
+        <w:pStyle w:val="ListBullet"/>
+      </w:pPr>
+      <w:r>
+        <w:t>Deployed to staging/UAT and verified</w:t>
+      </w:r>
+    </w:p>
+    <w:p>
+      <w:pPr>
+        <w:pStyle w:val="ListBullet"/>
+      </w:pPr>
+      <w:r>
+        <w:t>Product Owner sign-off obtained</w:t>
       </w:r>
     </w:p>
     <w:p>

</xml_diff>

<commit_message>
Define who/how/when verifies each Definition of Done item
Adds docs/DoD-Verification-Process.md as the canonical who/how/when
mapping for the 7 standard DoD items, mapped to a typical Jira workflow
(To Do -> In Progress -> Code Review -> QA/Regression -> UAT -> Done).

Every DoD line in both deliverables now embeds "Verified by" and "When"
inline, so each ticket is self-contained on Jira import. Updated the
skill so future PRD runs include this by default and reference the
verification-process doc as the canonical source.

Co-Authored-By: Claude Sonnet 5 <noreply@anthropic.com>
Claude-Session: https://claude.ai/code/session_018UqDCZmfeJsSLZ2VRvShwy
</commit_message>
<xml_diff>
--- a/deliverables/afml-reporting/AFML_Reporting_Epics_Tickets_Draft.docx
+++ b/deliverables/afml-reporting/AFML_Reporting_Epics_Tickets_Draft.docx
@@ -453,7 +453,7 @@
         <w:pStyle w:val="ListBullet"/>
       </w:pPr>
       <w:r>
-        <w:t>Acceptance criteria above are met and verified</w:t>
+        <w:t>Acceptance criteria above are met and verified — Verified by: QA/Tester; When: before moving to review</w:t>
       </w:r>
     </w:p>
     <w:p>
@@ -461,7 +461,7 @@
         <w:pStyle w:val="ListBullet"/>
       </w:pPr>
       <w:r>
-        <w:t>Code reviewed and approved</w:t>
+        <w:t>Code reviewed and approved — Verified by: peer engineer (second, more senior reviewer for compliance-critical/Four-Eyes stories); When: before merge</w:t>
       </w:r>
     </w:p>
     <w:p>
@@ -469,7 +469,7 @@
         <w:pStyle w:val="ListBullet"/>
       </w:pPr>
       <w:r>
-        <w:t>Automated tests (unit/integration) written and passing</w:t>
+        <w:t>Automated tests (unit/integration) written and passing — Verified by: implementing developer; When: CI gate, before merge</w:t>
       </w:r>
     </w:p>
     <w:p>
@@ -477,7 +477,7 @@
         <w:pStyle w:val="ListBullet"/>
       </w:pPr>
       <w:r>
-        <w:t>No regression introduced in existing functionality</w:t>
+        <w:t>No regression introduced in existing functionality — Verified by: QA + CI regression suite; When: after merge, before staging/UAT deploy</w:t>
       </w:r>
     </w:p>
     <w:p>
@@ -485,7 +485,7 @@
         <w:pStyle w:val="ListBullet"/>
       </w:pPr>
       <w:r>
-        <w:t>Relevant documentation updated</w:t>
+        <w:t>Relevant documentation updated — Verified by: developer (technical docs) + BA/PO (user-facing docs); When: before ticket marked Done</w:t>
       </w:r>
     </w:p>
     <w:p>
@@ -493,7 +493,7 @@
         <w:pStyle w:val="ListBullet"/>
       </w:pPr>
       <w:r>
-        <w:t>Deployed to staging/UAT and verified</w:t>
+        <w:t>Deployed to staging/UAT and verified — Verified by: DevOps/release engineer deploys, QA or PO verifies; When: after regression passes, before sign-off</w:t>
       </w:r>
     </w:p>
     <w:p>
@@ -501,7 +501,7 @@
         <w:pStyle w:val="ListBullet"/>
       </w:pPr>
       <w:r>
-        <w:t>Product Owner sign-off obtained</w:t>
+        <w:t>Product Owner sign-off obtained — Verified by: Product Owner (+ Compliance/MLRO for regulated tickets); When: final step before release eligibility</w:t>
       </w:r>
     </w:p>
     <w:p>
@@ -603,7 +603,7 @@
         <w:pStyle w:val="ListBullet"/>
       </w:pPr>
       <w:r>
-        <w:t>Acceptance criteria above are met and verified</w:t>
+        <w:t>Acceptance criteria above are met and verified — Verified by: QA/Tester; When: before moving to review</w:t>
       </w:r>
     </w:p>
     <w:p>
@@ -611,7 +611,7 @@
         <w:pStyle w:val="ListBullet"/>
       </w:pPr>
       <w:r>
-        <w:t>Code reviewed and approved</w:t>
+        <w:t>Code reviewed and approved — Verified by: peer engineer (second, more senior reviewer for compliance-critical/Four-Eyes stories); When: before merge</w:t>
       </w:r>
     </w:p>
     <w:p>
@@ -619,7 +619,7 @@
         <w:pStyle w:val="ListBullet"/>
       </w:pPr>
       <w:r>
-        <w:t>Automated tests (unit/integration) written and passing</w:t>
+        <w:t>Automated tests (unit/integration) written and passing — Verified by: implementing developer; When: CI gate, before merge</w:t>
       </w:r>
     </w:p>
     <w:p>
@@ -627,7 +627,7 @@
         <w:pStyle w:val="ListBullet"/>
       </w:pPr>
       <w:r>
-        <w:t>No regression introduced in existing functionality</w:t>
+        <w:t>No regression introduced in existing functionality — Verified by: QA + CI regression suite; When: after merge, before staging/UAT deploy</w:t>
       </w:r>
     </w:p>
     <w:p>
@@ -635,7 +635,7 @@
         <w:pStyle w:val="ListBullet"/>
       </w:pPr>
       <w:r>
-        <w:t>Relevant documentation updated</w:t>
+        <w:t>Relevant documentation updated — Verified by: developer (technical docs) + BA/PO (user-facing docs); When: before ticket marked Done</w:t>
       </w:r>
     </w:p>
     <w:p>
@@ -643,7 +643,7 @@
         <w:pStyle w:val="ListBullet"/>
       </w:pPr>
       <w:r>
-        <w:t>Deployed to staging/UAT and verified</w:t>
+        <w:t>Deployed to staging/UAT and verified — Verified by: DevOps/release engineer deploys, QA or PO verifies; When: after regression passes, before sign-off</w:t>
       </w:r>
     </w:p>
     <w:p>
@@ -651,7 +651,7 @@
         <w:pStyle w:val="ListBullet"/>
       </w:pPr>
       <w:r>
-        <w:t>Product Owner sign-off obtained</w:t>
+        <w:t>Product Owner sign-off obtained — Verified by: Product Owner (+ Compliance/MLRO for regulated tickets); When: final step before release eligibility</w:t>
       </w:r>
     </w:p>
     <w:p>
@@ -753,7 +753,7 @@
         <w:pStyle w:val="ListBullet"/>
       </w:pPr>
       <w:r>
-        <w:t>Acceptance criteria above are met and verified</w:t>
+        <w:t>Acceptance criteria above are met and verified — Verified by: QA/Tester; When: before moving to review</w:t>
       </w:r>
     </w:p>
     <w:p>
@@ -761,7 +761,7 @@
         <w:pStyle w:val="ListBullet"/>
       </w:pPr>
       <w:r>
-        <w:t>Code reviewed and approved</w:t>
+        <w:t>Code reviewed and approved — Verified by: peer engineer (second, more senior reviewer for compliance-critical/Four-Eyes stories); When: before merge</w:t>
       </w:r>
     </w:p>
     <w:p>
@@ -769,7 +769,7 @@
         <w:pStyle w:val="ListBullet"/>
       </w:pPr>
       <w:r>
-        <w:t>Automated tests (unit/integration) written and passing</w:t>
+        <w:t>Automated tests (unit/integration) written and passing — Verified by: implementing developer; When: CI gate, before merge</w:t>
       </w:r>
     </w:p>
     <w:p>
@@ -777,7 +777,7 @@
         <w:pStyle w:val="ListBullet"/>
       </w:pPr>
       <w:r>
-        <w:t>No regression introduced in existing functionality</w:t>
+        <w:t>No regression introduced in existing functionality — Verified by: QA + CI regression suite; When: after merge, before staging/UAT deploy</w:t>
       </w:r>
     </w:p>
     <w:p>
@@ -785,7 +785,7 @@
         <w:pStyle w:val="ListBullet"/>
       </w:pPr>
       <w:r>
-        <w:t>Relevant documentation updated</w:t>
+        <w:t>Relevant documentation updated — Verified by: developer (technical docs) + BA/PO (user-facing docs); When: before ticket marked Done</w:t>
       </w:r>
     </w:p>
     <w:p>
@@ -793,7 +793,7 @@
         <w:pStyle w:val="ListBullet"/>
       </w:pPr>
       <w:r>
-        <w:t>Deployed to staging/UAT and verified</w:t>
+        <w:t>Deployed to staging/UAT and verified — Verified by: DevOps/release engineer deploys, QA or PO verifies; When: after regression passes, before sign-off</w:t>
       </w:r>
     </w:p>
     <w:p>
@@ -801,7 +801,7 @@
         <w:pStyle w:val="ListBullet"/>
       </w:pPr>
       <w:r>
-        <w:t>Product Owner sign-off obtained</w:t>
+        <w:t>Product Owner sign-off obtained — Verified by: Product Owner (+ Compliance/MLRO for regulated tickets); When: final step before release eligibility</w:t>
       </w:r>
     </w:p>
     <w:p>
@@ -919,7 +919,7 @@
         <w:pStyle w:val="ListBullet"/>
       </w:pPr>
       <w:r>
-        <w:t>Acceptance criteria above are met and verified</w:t>
+        <w:t>Acceptance criteria above are met and verified — Verified by: QA/Tester; When: before moving to review</w:t>
       </w:r>
     </w:p>
     <w:p>
@@ -927,7 +927,7 @@
         <w:pStyle w:val="ListBullet"/>
       </w:pPr>
       <w:r>
-        <w:t>Code reviewed and approved</w:t>
+        <w:t>Code reviewed and approved — Verified by: peer engineer (second, more senior reviewer for compliance-critical/Four-Eyes stories); When: before merge</w:t>
       </w:r>
     </w:p>
     <w:p>
@@ -935,7 +935,7 @@
         <w:pStyle w:val="ListBullet"/>
       </w:pPr>
       <w:r>
-        <w:t>Automated tests (unit/integration) written and passing</w:t>
+        <w:t>Automated tests (unit/integration) written and passing — Verified by: implementing developer; When: CI gate, before merge</w:t>
       </w:r>
     </w:p>
     <w:p>
@@ -943,7 +943,7 @@
         <w:pStyle w:val="ListBullet"/>
       </w:pPr>
       <w:r>
-        <w:t>No regression introduced in existing functionality</w:t>
+        <w:t>No regression introduced in existing functionality — Verified by: QA + CI regression suite; When: after merge, before staging/UAT deploy</w:t>
       </w:r>
     </w:p>
     <w:p>
@@ -951,7 +951,7 @@
         <w:pStyle w:val="ListBullet"/>
       </w:pPr>
       <w:r>
-        <w:t>Relevant documentation updated</w:t>
+        <w:t>Relevant documentation updated — Verified by: developer (technical docs) + BA/PO (user-facing docs); When: before ticket marked Done</w:t>
       </w:r>
     </w:p>
     <w:p>
@@ -959,7 +959,7 @@
         <w:pStyle w:val="ListBullet"/>
       </w:pPr>
       <w:r>
-        <w:t>Deployed to staging/UAT and verified</w:t>
+        <w:t>Deployed to staging/UAT and verified — Verified by: DevOps/release engineer deploys, QA or PO verifies; When: after regression passes, before sign-off</w:t>
       </w:r>
     </w:p>
     <w:p>
@@ -967,7 +967,7 @@
         <w:pStyle w:val="ListBullet"/>
       </w:pPr>
       <w:r>
-        <w:t>Product Owner sign-off obtained</w:t>
+        <w:t>Product Owner sign-off obtained — Verified by: Product Owner (+ Compliance/MLRO for regulated tickets); When: final step before release eligibility</w:t>
       </w:r>
     </w:p>
     <w:p>
@@ -1090,7 +1090,7 @@
         <w:pStyle w:val="ListBullet"/>
       </w:pPr>
       <w:r>
-        <w:t>Acceptance criteria above are met and verified</w:t>
+        <w:t>Acceptance criteria above are met and verified — Verified by: QA/Tester; When: before moving to review</w:t>
       </w:r>
     </w:p>
     <w:p>
@@ -1098,7 +1098,7 @@
         <w:pStyle w:val="ListBullet"/>
       </w:pPr>
       <w:r>
-        <w:t>Code reviewed and approved</w:t>
+        <w:t>Code reviewed and approved — Verified by: peer engineer (second, more senior reviewer for compliance-critical/Four-Eyes stories); When: before merge</w:t>
       </w:r>
     </w:p>
     <w:p>
@@ -1106,7 +1106,7 @@
         <w:pStyle w:val="ListBullet"/>
       </w:pPr>
       <w:r>
-        <w:t>Automated tests (unit/integration) written and passing</w:t>
+        <w:t>Automated tests (unit/integration) written and passing — Verified by: implementing developer; When: CI gate, before merge</w:t>
       </w:r>
     </w:p>
     <w:p>
@@ -1114,7 +1114,7 @@
         <w:pStyle w:val="ListBullet"/>
       </w:pPr>
       <w:r>
-        <w:t>No regression introduced in existing functionality</w:t>
+        <w:t>No regression introduced in existing functionality — Verified by: QA + CI regression suite; When: after merge, before staging/UAT deploy</w:t>
       </w:r>
     </w:p>
     <w:p>
@@ -1122,7 +1122,7 @@
         <w:pStyle w:val="ListBullet"/>
       </w:pPr>
       <w:r>
-        <w:t>Relevant documentation updated</w:t>
+        <w:t>Relevant documentation updated — Verified by: developer (technical docs) + BA/PO (user-facing docs); When: before ticket marked Done</w:t>
       </w:r>
     </w:p>
     <w:p>
@@ -1130,7 +1130,7 @@
         <w:pStyle w:val="ListBullet"/>
       </w:pPr>
       <w:r>
-        <w:t>Deployed to staging/UAT and verified</w:t>
+        <w:t>Deployed to staging/UAT and verified — Verified by: DevOps/release engineer deploys, QA or PO verifies; When: after regression passes, before sign-off</w:t>
       </w:r>
     </w:p>
     <w:p>
@@ -1138,7 +1138,7 @@
         <w:pStyle w:val="ListBullet"/>
       </w:pPr>
       <w:r>
-        <w:t>Product Owner sign-off obtained</w:t>
+        <w:t>Product Owner sign-off obtained — Verified by: Product Owner (+ Compliance/MLRO for regulated tickets); When: final step before release eligibility</w:t>
       </w:r>
     </w:p>
     <w:p>
@@ -1232,7 +1232,7 @@
         <w:pStyle w:val="ListBullet"/>
       </w:pPr>
       <w:r>
-        <w:t>Acceptance criteria above are met and verified</w:t>
+        <w:t>Acceptance criteria above are met and verified — Verified by: QA/Tester; When: before moving to review</w:t>
       </w:r>
     </w:p>
     <w:p>
@@ -1240,7 +1240,7 @@
         <w:pStyle w:val="ListBullet"/>
       </w:pPr>
       <w:r>
-        <w:t>Code reviewed and approved</w:t>
+        <w:t>Code reviewed and approved — Verified by: peer engineer (second, more senior reviewer for compliance-critical/Four-Eyes stories); When: before merge</w:t>
       </w:r>
     </w:p>
     <w:p>
@@ -1248,7 +1248,7 @@
         <w:pStyle w:val="ListBullet"/>
       </w:pPr>
       <w:r>
-        <w:t>Automated tests (unit/integration) written and passing</w:t>
+        <w:t>Automated tests (unit/integration) written and passing — Verified by: implementing developer; When: CI gate, before merge</w:t>
       </w:r>
     </w:p>
     <w:p>
@@ -1256,7 +1256,7 @@
         <w:pStyle w:val="ListBullet"/>
       </w:pPr>
       <w:r>
-        <w:t>No regression introduced in existing functionality</w:t>
+        <w:t>No regression introduced in existing functionality — Verified by: QA + CI regression suite; When: after merge, before staging/UAT deploy</w:t>
       </w:r>
     </w:p>
     <w:p>
@@ -1264,7 +1264,7 @@
         <w:pStyle w:val="ListBullet"/>
       </w:pPr>
       <w:r>
-        <w:t>Relevant documentation updated</w:t>
+        <w:t>Relevant documentation updated — Verified by: developer (technical docs) + BA/PO (user-facing docs); When: before ticket marked Done</w:t>
       </w:r>
     </w:p>
     <w:p>
@@ -1272,7 +1272,7 @@
         <w:pStyle w:val="ListBullet"/>
       </w:pPr>
       <w:r>
-        <w:t>Deployed to staging/UAT and verified</w:t>
+        <w:t>Deployed to staging/UAT and verified — Verified by: DevOps/release engineer deploys, QA or PO verifies; When: after regression passes, before sign-off</w:t>
       </w:r>
     </w:p>
     <w:p>
@@ -1280,7 +1280,7 @@
         <w:pStyle w:val="ListBullet"/>
       </w:pPr>
       <w:r>
-        <w:t>Product Owner sign-off obtained</w:t>
+        <w:t>Product Owner sign-off obtained — Verified by: Product Owner (+ Compliance/MLRO for regulated tickets); When: final step before release eligibility</w:t>
       </w:r>
     </w:p>
     <w:p>
@@ -1369,7 +1369,7 @@
         <w:pStyle w:val="ListBullet"/>
       </w:pPr>
       <w:r>
-        <w:t>Acceptance criteria above are met and verified</w:t>
+        <w:t>Acceptance criteria above are met and verified — Verified by: QA/Tester; When: before moving to review</w:t>
       </w:r>
     </w:p>
     <w:p>
@@ -1377,7 +1377,7 @@
         <w:pStyle w:val="ListBullet"/>
       </w:pPr>
       <w:r>
-        <w:t>Code reviewed and approved</w:t>
+        <w:t>Code reviewed and approved — Verified by: peer engineer (second, more senior reviewer for compliance-critical/Four-Eyes stories); When: before merge</w:t>
       </w:r>
     </w:p>
     <w:p>
@@ -1385,7 +1385,7 @@
         <w:pStyle w:val="ListBullet"/>
       </w:pPr>
       <w:r>
-        <w:t>Automated tests (unit/integration) written and passing</w:t>
+        <w:t>Automated tests (unit/integration) written and passing — Verified by: implementing developer; When: CI gate, before merge</w:t>
       </w:r>
     </w:p>
     <w:p>
@@ -1393,7 +1393,7 @@
         <w:pStyle w:val="ListBullet"/>
       </w:pPr>
       <w:r>
-        <w:t>No regression introduced in existing functionality</w:t>
+        <w:t>No regression introduced in existing functionality — Verified by: QA + CI regression suite; When: after merge, before staging/UAT deploy</w:t>
       </w:r>
     </w:p>
     <w:p>
@@ -1401,7 +1401,7 @@
         <w:pStyle w:val="ListBullet"/>
       </w:pPr>
       <w:r>
-        <w:t>Relevant documentation updated</w:t>
+        <w:t>Relevant documentation updated — Verified by: developer (technical docs) + BA/PO (user-facing docs); When: before ticket marked Done</w:t>
       </w:r>
     </w:p>
     <w:p>
@@ -1409,7 +1409,7 @@
         <w:pStyle w:val="ListBullet"/>
       </w:pPr>
       <w:r>
-        <w:t>Deployed to staging/UAT and verified</w:t>
+        <w:t>Deployed to staging/UAT and verified — Verified by: DevOps/release engineer deploys, QA or PO verifies; When: after regression passes, before sign-off</w:t>
       </w:r>
     </w:p>
     <w:p>
@@ -1417,7 +1417,7 @@
         <w:pStyle w:val="ListBullet"/>
       </w:pPr>
       <w:r>
-        <w:t>Product Owner sign-off obtained</w:t>
+        <w:t>Product Owner sign-off obtained — Verified by: Product Owner (+ Compliance/MLRO for regulated tickets); When: final step before release eligibility</w:t>
       </w:r>
     </w:p>
     <w:p>
@@ -1524,7 +1524,7 @@
         <w:pStyle w:val="ListBullet"/>
       </w:pPr>
       <w:r>
-        <w:t>Acceptance criteria above are met and verified</w:t>
+        <w:t>Acceptance criteria above are met and verified — Verified by: QA/Tester; When: before moving to review</w:t>
       </w:r>
     </w:p>
     <w:p>
@@ -1532,7 +1532,7 @@
         <w:pStyle w:val="ListBullet"/>
       </w:pPr>
       <w:r>
-        <w:t>Code reviewed and approved</w:t>
+        <w:t>Code reviewed and approved — Verified by: peer engineer (second, more senior reviewer for compliance-critical/Four-Eyes stories); When: before merge</w:t>
       </w:r>
     </w:p>
     <w:p>
@@ -1540,7 +1540,7 @@
         <w:pStyle w:val="ListBullet"/>
       </w:pPr>
       <w:r>
-        <w:t>Automated tests (unit/integration) written and passing</w:t>
+        <w:t>Automated tests (unit/integration) written and passing — Verified by: implementing developer; When: CI gate, before merge</w:t>
       </w:r>
     </w:p>
     <w:p>
@@ -1548,7 +1548,7 @@
         <w:pStyle w:val="ListBullet"/>
       </w:pPr>
       <w:r>
-        <w:t>No regression introduced in existing functionality</w:t>
+        <w:t>No regression introduced in existing functionality — Verified by: QA + CI regression suite; When: after merge, before staging/UAT deploy</w:t>
       </w:r>
     </w:p>
     <w:p>
@@ -1556,7 +1556,7 @@
         <w:pStyle w:val="ListBullet"/>
       </w:pPr>
       <w:r>
-        <w:t>Relevant documentation updated</w:t>
+        <w:t>Relevant documentation updated — Verified by: developer (technical docs) + BA/PO (user-facing docs); When: before ticket marked Done</w:t>
       </w:r>
     </w:p>
     <w:p>
@@ -1564,7 +1564,7 @@
         <w:pStyle w:val="ListBullet"/>
       </w:pPr>
       <w:r>
-        <w:t>Deployed to staging/UAT and verified</w:t>
+        <w:t>Deployed to staging/UAT and verified — Verified by: DevOps/release engineer deploys, QA or PO verifies; When: after regression passes, before sign-off</w:t>
       </w:r>
     </w:p>
     <w:p>
@@ -1572,7 +1572,7 @@
         <w:pStyle w:val="ListBullet"/>
       </w:pPr>
       <w:r>
-        <w:t>Product Owner sign-off obtained</w:t>
+        <w:t>Product Owner sign-off obtained — Verified by: Product Owner (+ Compliance/MLRO for regulated tickets); When: final step before release eligibility</w:t>
       </w:r>
     </w:p>
     <w:p>
@@ -1650,7 +1650,7 @@
         <w:pStyle w:val="ListBullet"/>
       </w:pPr>
       <w:r>
-        <w:t>Acceptance criteria above are met and verified</w:t>
+        <w:t>Acceptance criteria above are met and verified — Verified by: QA/Tester; When: before moving to review</w:t>
       </w:r>
     </w:p>
     <w:p>
@@ -1658,7 +1658,7 @@
         <w:pStyle w:val="ListBullet"/>
       </w:pPr>
       <w:r>
-        <w:t>Code reviewed and approved</w:t>
+        <w:t>Code reviewed and approved — Verified by: peer engineer (second, more senior reviewer for compliance-critical/Four-Eyes stories); When: before merge</w:t>
       </w:r>
     </w:p>
     <w:p>
@@ -1666,7 +1666,7 @@
         <w:pStyle w:val="ListBullet"/>
       </w:pPr>
       <w:r>
-        <w:t>Automated tests (unit/integration) written and passing</w:t>
+        <w:t>Automated tests (unit/integration) written and passing — Verified by: implementing developer; When: CI gate, before merge</w:t>
       </w:r>
     </w:p>
     <w:p>
@@ -1674,7 +1674,7 @@
         <w:pStyle w:val="ListBullet"/>
       </w:pPr>
       <w:r>
-        <w:t>No regression introduced in existing functionality</w:t>
+        <w:t>No regression introduced in existing functionality — Verified by: QA + CI regression suite; When: after merge, before staging/UAT deploy</w:t>
       </w:r>
     </w:p>
     <w:p>
@@ -1682,7 +1682,7 @@
         <w:pStyle w:val="ListBullet"/>
       </w:pPr>
       <w:r>
-        <w:t>Relevant documentation updated</w:t>
+        <w:t>Relevant documentation updated — Verified by: developer (technical docs) + BA/PO (user-facing docs); When: before ticket marked Done</w:t>
       </w:r>
     </w:p>
     <w:p>
@@ -1690,7 +1690,7 @@
         <w:pStyle w:val="ListBullet"/>
       </w:pPr>
       <w:r>
-        <w:t>Deployed to staging/UAT and verified</w:t>
+        <w:t>Deployed to staging/UAT and verified — Verified by: DevOps/release engineer deploys, QA or PO verifies; When: after regression passes, before sign-off</w:t>
       </w:r>
     </w:p>
     <w:p>
@@ -1698,7 +1698,7 @@
         <w:pStyle w:val="ListBullet"/>
       </w:pPr>
       <w:r>
-        <w:t>Product Owner sign-off obtained</w:t>
+        <w:t>Product Owner sign-off obtained — Verified by: Product Owner (+ Compliance/MLRO for regulated tickets); When: final step before release eligibility</w:t>
       </w:r>
     </w:p>
     <w:p>
@@ -1784,7 +1784,7 @@
         <w:pStyle w:val="ListBullet"/>
       </w:pPr>
       <w:r>
-        <w:t>Acceptance criteria above are met and verified</w:t>
+        <w:t>Acceptance criteria above are met and verified — Verified by: QA/Tester; When: before moving to review</w:t>
       </w:r>
     </w:p>
     <w:p>
@@ -1792,7 +1792,7 @@
         <w:pStyle w:val="ListBullet"/>
       </w:pPr>
       <w:r>
-        <w:t>Code reviewed and approved</w:t>
+        <w:t>Code reviewed and approved — Verified by: peer engineer (second, more senior reviewer for compliance-critical/Four-Eyes stories); When: before merge</w:t>
       </w:r>
     </w:p>
     <w:p>
@@ -1800,7 +1800,7 @@
         <w:pStyle w:val="ListBullet"/>
       </w:pPr>
       <w:r>
-        <w:t>Automated tests (unit/integration) written and passing</w:t>
+        <w:t>Automated tests (unit/integration) written and passing — Verified by: implementing developer; When: CI gate, before merge</w:t>
       </w:r>
     </w:p>
     <w:p>
@@ -1808,7 +1808,7 @@
         <w:pStyle w:val="ListBullet"/>
       </w:pPr>
       <w:r>
-        <w:t>No regression introduced in existing functionality</w:t>
+        <w:t>No regression introduced in existing functionality — Verified by: QA + CI regression suite; When: after merge, before staging/UAT deploy</w:t>
       </w:r>
     </w:p>
     <w:p>
@@ -1816,7 +1816,7 @@
         <w:pStyle w:val="ListBullet"/>
       </w:pPr>
       <w:r>
-        <w:t>Relevant documentation updated</w:t>
+        <w:t>Relevant documentation updated — Verified by: developer (technical docs) + BA/PO (user-facing docs); When: before ticket marked Done</w:t>
       </w:r>
     </w:p>
     <w:p>
@@ -1824,7 +1824,7 @@
         <w:pStyle w:val="ListBullet"/>
       </w:pPr>
       <w:r>
-        <w:t>Deployed to staging/UAT and verified</w:t>
+        <w:t>Deployed to staging/UAT and verified — Verified by: DevOps/release engineer deploys, QA or PO verifies; When: after regression passes, before sign-off</w:t>
       </w:r>
     </w:p>
     <w:p>
@@ -1832,7 +1832,7 @@
         <w:pStyle w:val="ListBullet"/>
       </w:pPr>
       <w:r>
-        <w:t>Product Owner sign-off obtained</w:t>
+        <w:t>Product Owner sign-off obtained — Verified by: Product Owner (+ Compliance/MLRO for regulated tickets); When: final step before release eligibility</w:t>
       </w:r>
     </w:p>
     <w:p>
@@ -1902,7 +1902,7 @@
         <w:pStyle w:val="ListBullet"/>
       </w:pPr>
       <w:r>
-        <w:t>Acceptance criteria above are met and verified</w:t>
+        <w:t>Acceptance criteria above are met and verified — Verified by: QA/Tester; When: before moving to review</w:t>
       </w:r>
     </w:p>
     <w:p>
@@ -1910,7 +1910,7 @@
         <w:pStyle w:val="ListBullet"/>
       </w:pPr>
       <w:r>
-        <w:t>Code reviewed and approved</w:t>
+        <w:t>Code reviewed and approved — Verified by: peer engineer (second, more senior reviewer for compliance-critical/Four-Eyes stories); When: before merge</w:t>
       </w:r>
     </w:p>
     <w:p>
@@ -1918,7 +1918,7 @@
         <w:pStyle w:val="ListBullet"/>
       </w:pPr>
       <w:r>
-        <w:t>Automated tests (unit/integration) written and passing</w:t>
+        <w:t>Automated tests (unit/integration) written and passing — Verified by: implementing developer; When: CI gate, before merge</w:t>
       </w:r>
     </w:p>
     <w:p>
@@ -1926,7 +1926,7 @@
         <w:pStyle w:val="ListBullet"/>
       </w:pPr>
       <w:r>
-        <w:t>No regression introduced in existing functionality</w:t>
+        <w:t>No regression introduced in existing functionality — Verified by: QA + CI regression suite; When: after merge, before staging/UAT deploy</w:t>
       </w:r>
     </w:p>
     <w:p>
@@ -1934,7 +1934,7 @@
         <w:pStyle w:val="ListBullet"/>
       </w:pPr>
       <w:r>
-        <w:t>Relevant documentation updated</w:t>
+        <w:t>Relevant documentation updated — Verified by: developer (technical docs) + BA/PO (user-facing docs); When: before ticket marked Done</w:t>
       </w:r>
     </w:p>
     <w:p>
@@ -1942,7 +1942,7 @@
         <w:pStyle w:val="ListBullet"/>
       </w:pPr>
       <w:r>
-        <w:t>Deployed to staging/UAT and verified</w:t>
+        <w:t>Deployed to staging/UAT and verified — Verified by: DevOps/release engineer deploys, QA or PO verifies; When: after regression passes, before sign-off</w:t>
       </w:r>
     </w:p>
     <w:p>
@@ -1950,7 +1950,7 @@
         <w:pStyle w:val="ListBullet"/>
       </w:pPr>
       <w:r>
-        <w:t>Product Owner sign-off obtained</w:t>
+        <w:t>Product Owner sign-off obtained — Verified by: Product Owner (+ Compliance/MLRO for regulated tickets); When: final step before release eligibility</w:t>
       </w:r>
     </w:p>
     <w:p>
@@ -2028,7 +2028,7 @@
         <w:pStyle w:val="ListBullet"/>
       </w:pPr>
       <w:r>
-        <w:t>Acceptance criteria above are met and verified</w:t>
+        <w:t>Acceptance criteria above are met and verified — Verified by: QA/Tester; When: before moving to review</w:t>
       </w:r>
     </w:p>
     <w:p>
@@ -2036,7 +2036,7 @@
         <w:pStyle w:val="ListBullet"/>
       </w:pPr>
       <w:r>
-        <w:t>Code reviewed and approved</w:t>
+        <w:t>Code reviewed and approved — Verified by: peer engineer (second, more senior reviewer for compliance-critical/Four-Eyes stories); When: before merge</w:t>
       </w:r>
     </w:p>
     <w:p>
@@ -2044,7 +2044,7 @@
         <w:pStyle w:val="ListBullet"/>
       </w:pPr>
       <w:r>
-        <w:t>Automated tests (unit/integration) written and passing</w:t>
+        <w:t>Automated tests (unit/integration) written and passing — Verified by: implementing developer; When: CI gate, before merge</w:t>
       </w:r>
     </w:p>
     <w:p>
@@ -2052,7 +2052,7 @@
         <w:pStyle w:val="ListBullet"/>
       </w:pPr>
       <w:r>
-        <w:t>No regression introduced in existing functionality</w:t>
+        <w:t>No regression introduced in existing functionality — Verified by: QA + CI regression suite; When: after merge, before staging/UAT deploy</w:t>
       </w:r>
     </w:p>
     <w:p>
@@ -2060,7 +2060,7 @@
         <w:pStyle w:val="ListBullet"/>
       </w:pPr>
       <w:r>
-        <w:t>Relevant documentation updated</w:t>
+        <w:t>Relevant documentation updated — Verified by: developer (technical docs) + BA/PO (user-facing docs); When: before ticket marked Done</w:t>
       </w:r>
     </w:p>
     <w:p>
@@ -2068,7 +2068,7 @@
         <w:pStyle w:val="ListBullet"/>
       </w:pPr>
       <w:r>
-        <w:t>Deployed to staging/UAT and verified</w:t>
+        <w:t>Deployed to staging/UAT and verified — Verified by: DevOps/release engineer deploys, QA or PO verifies; When: after regression passes, before sign-off</w:t>
       </w:r>
     </w:p>
     <w:p>
@@ -2076,7 +2076,7 @@
         <w:pStyle w:val="ListBullet"/>
       </w:pPr>
       <w:r>
-        <w:t>Product Owner sign-off obtained</w:t>
+        <w:t>Product Owner sign-off obtained — Verified by: Product Owner (+ Compliance/MLRO for regulated tickets); When: final step before release eligibility</w:t>
       </w:r>
     </w:p>
     <w:p>
@@ -2154,7 +2154,7 @@
         <w:pStyle w:val="ListBullet"/>
       </w:pPr>
       <w:r>
-        <w:t>Acceptance criteria above are met and verified</w:t>
+        <w:t>Acceptance criteria above are met and verified — Verified by: QA/Tester; When: before moving to review</w:t>
       </w:r>
     </w:p>
     <w:p>
@@ -2162,7 +2162,7 @@
         <w:pStyle w:val="ListBullet"/>
       </w:pPr>
       <w:r>
-        <w:t>Code reviewed and approved</w:t>
+        <w:t>Code reviewed and approved — Verified by: peer engineer (second, more senior reviewer for compliance-critical/Four-Eyes stories); When: before merge</w:t>
       </w:r>
     </w:p>
     <w:p>
@@ -2170,7 +2170,7 @@
         <w:pStyle w:val="ListBullet"/>
       </w:pPr>
       <w:r>
-        <w:t>Automated tests (unit/integration) written and passing</w:t>
+        <w:t>Automated tests (unit/integration) written and passing — Verified by: implementing developer; When: CI gate, before merge</w:t>
       </w:r>
     </w:p>
     <w:p>
@@ -2178,7 +2178,7 @@
         <w:pStyle w:val="ListBullet"/>
       </w:pPr>
       <w:r>
-        <w:t>No regression introduced in existing functionality</w:t>
+        <w:t>No regression introduced in existing functionality — Verified by: QA + CI regression suite; When: after merge, before staging/UAT deploy</w:t>
       </w:r>
     </w:p>
     <w:p>
@@ -2186,7 +2186,7 @@
         <w:pStyle w:val="ListBullet"/>
       </w:pPr>
       <w:r>
-        <w:t>Relevant documentation updated</w:t>
+        <w:t>Relevant documentation updated — Verified by: developer (technical docs) + BA/PO (user-facing docs); When: before ticket marked Done</w:t>
       </w:r>
     </w:p>
     <w:p>
@@ -2194,7 +2194,7 @@
         <w:pStyle w:val="ListBullet"/>
       </w:pPr>
       <w:r>
-        <w:t>Deployed to staging/UAT and verified</w:t>
+        <w:t>Deployed to staging/UAT and verified — Verified by: DevOps/release engineer deploys, QA or PO verifies; When: after regression passes, before sign-off</w:t>
       </w:r>
     </w:p>
     <w:p>
@@ -2202,7 +2202,7 @@
         <w:pStyle w:val="ListBullet"/>
       </w:pPr>
       <w:r>
-        <w:t>Product Owner sign-off obtained</w:t>
+        <w:t>Product Owner sign-off obtained — Verified by: Product Owner (+ Compliance/MLRO for regulated tickets); When: final step before release eligibility</w:t>
       </w:r>
     </w:p>
     <w:p>

</xml_diff>